<commit_message>
Fajl run_pipeline.py izmenjen tako da ispisuje logove u results/run_logs nakon svakog pokretanja sa opisima sta se desava u kodu
</commit_message>
<xml_diff>
--- a/deliverables/Project_Documentation.docx
+++ b/deliverables/Project_Documentation.docx
@@ -37,7 +37,7 @@
         <w:pStyle w:val="Heading1"/>
       </w:pPr>
       <w:r>
-        <w:t>Part 1: Biological and Genomic Background</w:t>
+        <w:t>Part 1: Project Overview (Detailed)</w:t>
       </w:r>
     </w:p>
     <w:p>
@@ -45,17 +45,159 @@
         <w:pStyle w:val="Heading2"/>
       </w:pPr>
       <w:r>
-        <w:t>1.1 What is the biological question?</w:t>
+        <w:t>1.1 Biological context</w:t>
       </w:r>
     </w:p>
     <w:p>
       <w:r>
-        <w:t>Nanoplastics (tiny plastic particles, often &lt; 1 µm) can enter the bloodstream and interact directly with immune cells. Particle size (e.g. 40 nm vs 200 nm) may change how strongly and in which cell types the immune system responds.</w:t>
+        <w:t>Nanoplastics are very small plastic particles, often in the nanometer range. When they enter the bloodstream, they can interact directly with immune cells. This project tests whether particle size changes the immune response.</w:t>
       </w:r>
     </w:p>
     <w:p>
-      <w:r>
-        <w:t>This project uses single-cell RNA sequencing (scRNA-seq) on human peripheral blood immune cells (PBMC) from one donor exposed to:</w:t>
+      <w:pPr>
+        <w:pStyle w:val="Heading2"/>
+      </w:pPr>
+      <w:r>
+        <w:t>1.2 Experimental design</w:t>
+      </w:r>
+    </w:p>
+    <w:tbl>
+      <w:tblPr>
+        <w:tblStyle w:val="TableGrid"/>
+        <w:tblW w:type="auto" w:w="0"/>
+        <w:tblLook w:firstColumn="1" w:firstRow="1" w:lastColumn="0" w:lastRow="0" w:noHBand="0" w:noVBand="1" w:val="04A0"/>
+      </w:tblPr>
+      <w:tblGrid>
+        <w:gridCol w:w="4320"/>
+        <w:gridCol w:w="4320"/>
+      </w:tblGrid>
+      <w:tr>
+        <w:tc>
+          <w:tcPr>
+            <w:tcW w:type="dxa" w:w="4320"/>
+          </w:tcPr>
+          <w:p>
+            <w:r>
+              <w:t>Sample</w:t>
+            </w:r>
+          </w:p>
+        </w:tc>
+        <w:tc>
+          <w:tcPr>
+            <w:tcW w:type="dxa" w:w="4320"/>
+          </w:tcPr>
+          <w:p>
+            <w:r>
+              <w:t>Treatment</w:t>
+            </w:r>
+          </w:p>
+        </w:tc>
+      </w:tr>
+      <w:tr>
+        <w:tc>
+          <w:tcPr>
+            <w:tcW w:type="dxa" w:w="4320"/>
+          </w:tcPr>
+          <w:p>
+            <w:r>
+              <w:t>Sample 1</w:t>
+            </w:r>
+          </w:p>
+        </w:tc>
+        <w:tc>
+          <w:tcPr>
+            <w:tcW w:type="dxa" w:w="4320"/>
+          </w:tcPr>
+          <w:p>
+            <w:r>
+              <w:t>40 nm carboxylated polystyrene nanoparticles (PSNPs)</w:t>
+            </w:r>
+          </w:p>
+        </w:tc>
+      </w:tr>
+      <w:tr>
+        <w:tc>
+          <w:tcPr>
+            <w:tcW w:type="dxa" w:w="4320"/>
+          </w:tcPr>
+          <w:p>
+            <w:r>
+              <w:t>Sample 2</w:t>
+            </w:r>
+          </w:p>
+        </w:tc>
+        <w:tc>
+          <w:tcPr>
+            <w:tcW w:type="dxa" w:w="4320"/>
+          </w:tcPr>
+          <w:p>
+            <w:r>
+              <w:t>200 nm PSNPs</w:t>
+            </w:r>
+          </w:p>
+        </w:tc>
+      </w:tr>
+      <w:tr>
+        <w:tc>
+          <w:tcPr>
+            <w:tcW w:type="dxa" w:w="4320"/>
+          </w:tcPr>
+          <w:p>
+            <w:r>
+              <w:t>Sample 3</w:t>
+            </w:r>
+          </w:p>
+        </w:tc>
+        <w:tc>
+          <w:tcPr>
+            <w:tcW w:type="dxa" w:w="4320"/>
+          </w:tcPr>
+          <w:p>
+            <w:r>
+              <w:t>Mixture of 40 nm + 200 nm</w:t>
+            </w:r>
+          </w:p>
+        </w:tc>
+      </w:tr>
+      <w:tr>
+        <w:tc>
+          <w:tcPr>
+            <w:tcW w:type="dxa" w:w="4320"/>
+          </w:tcPr>
+          <w:p>
+            <w:r>
+              <w:t>Sample 4</w:t>
+            </w:r>
+          </w:p>
+        </w:tc>
+        <w:tc>
+          <w:tcPr>
+            <w:tcW w:type="dxa" w:w="4320"/>
+          </w:tcPr>
+          <w:p>
+            <w:r>
+              <w:t>Control (no nanoparticles)</w:t>
+            </w:r>
+          </w:p>
+        </w:tc>
+      </w:tr>
+    </w:tbl>
+    <w:p>
+      <w:r>
+        <w:t>All four samples come from one donor. Cells are PBMC (peripheral blood mononuclear cells): mainly T cells, B cells, NK cells, monocytes, and some dendritic cells.</w:t>
+      </w:r>
+    </w:p>
+    <w:p>
+      <w:pPr>
+        <w:pStyle w:val="Heading2"/>
+      </w:pPr>
+      <w:r>
+        <w:t>1.3 Technology: single-cell RNA sequencing</w:t>
+      </w:r>
+    </w:p>
+    <w:p>
+      <w:r>
+        <w:t>Bulk RNA-seq averages gene expression across millions of mixed cells. scRNA-seq measures RNA in each cell separately. That allows you to ask:</w:t>
       </w:r>
     </w:p>
     <w:p>
@@ -63,7 +205,7 @@
         <w:pStyle w:val="ListBullet"/>
       </w:pPr>
       <w:r>
-        <w:t>Sample 1: 40 nm carboxylated polystyrene nanoparticles (PSNPs)</w:t>
+        <w:t>Which cell types respond to nanoplastics?</w:t>
       </w:r>
     </w:p>
     <w:p>
@@ -71,7 +213,7 @@
         <w:pStyle w:val="ListBullet"/>
       </w:pPr>
       <w:r>
-        <w:t>Sample 2: 200 nm PSNPs</w:t>
+        <w:t>Which genes change within each cell type?</w:t>
       </w:r>
     </w:p>
     <w:p>
@@ -79,7 +221,15 @@
         <w:pStyle w:val="ListBullet"/>
       </w:pPr>
       <w:r>
-        <w:t>Sample 3: mixture of 40 nm + 200 nm</w:t>
+        <w:t>Are effects specific to 40 nm, 200 nm, or only seen in the mixture?</w:t>
+      </w:r>
+    </w:p>
+    <w:p>
+      <w:pPr>
+        <w:pStyle w:val="Heading2"/>
+      </w:pPr>
+      <w:r>
+        <w:t>1.4 What the pipeline does (workflow)</w:t>
       </w:r>
     </w:p>
     <w:p>
@@ -87,7 +237,76 @@
         <w:pStyle w:val="ListBullet"/>
       </w:pPr>
       <w:r>
-        <w:t>Sample 4: control (no exposure)</w:t>
+        <w:t>Download data from Zenodo (.h5ad files)</w:t>
+      </w:r>
+    </w:p>
+    <w:p>
+      <w:pPr>
+        <w:pStyle w:val="ListBullet"/>
+      </w:pPr>
+      <w:r>
+        <w:t>QC — remove low-quality cells</w:t>
+      </w:r>
+    </w:p>
+    <w:p>
+      <w:pPr>
+        <w:pStyle w:val="ListBullet"/>
+      </w:pPr>
+      <w:r>
+        <w:t>Merge 4 samples + batch correction (Combat)</w:t>
+      </w:r>
+    </w:p>
+    <w:p>
+      <w:pPr>
+        <w:pStyle w:val="ListBullet"/>
+      </w:pPr>
+      <w:r>
+        <w:t>Clustering — UMAP and Leiden</w:t>
+      </w:r>
+    </w:p>
+    <w:p>
+      <w:pPr>
+        <w:pStyle w:val="ListBullet"/>
+      </w:pPr>
+      <w:r>
+        <w:t>Cell type annotation (markers, CoDi, optional Azimuth)</w:t>
+      </w:r>
+    </w:p>
+    <w:p>
+      <w:pPr>
+        <w:pStyle w:val="ListBullet"/>
+      </w:pPr>
+      <w:r>
+        <w:t>Composition analysis — cell type proportions per condition</w:t>
+      </w:r>
+    </w:p>
+    <w:p>
+      <w:pPr>
+        <w:pStyle w:val="ListBullet"/>
+      </w:pPr>
+      <w:r>
+        <w:t>Differential expression — genes changed vs control</w:t>
+      </w:r>
+    </w:p>
+    <w:p>
+      <w:pPr>
+        <w:pStyle w:val="ListBullet"/>
+      </w:pPr>
+      <w:r>
+        <w:t>Pathway enrichment — GO, KEGG, Reactome</w:t>
+      </w:r>
+    </w:p>
+    <w:p>
+      <w:pPr>
+        <w:pStyle w:val="ListBullet"/>
+      </w:pPr>
+      <w:r>
+        <w:t>Size-specific comparison — 40 nm vs 200 nm vs mix</w:t>
+      </w:r>
+    </w:p>
+    <w:p>
+      <w:r>
+        <w:t>Scientific question: How does nanoparticle size reshape the immune transcriptome at single-cell resolution?</w:t>
       </w:r>
     </w:p>
     <w:p>
@@ -95,17 +314,7 @@
         <w:pStyle w:val="Heading2"/>
       </w:pPr>
       <w:r>
-        <w:t>1.2 What is scRNA-seq?</w:t>
-      </w:r>
-    </w:p>
-    <w:p>
-      <w:r>
-        <w:t>Bulk RNA-seq measures average gene expression across millions of cells mixed together. scRNA-seq captures RNA from thousands of individual cells separately.</w:t>
-      </w:r>
-    </w:p>
-    <w:p>
-      <w:r>
-        <w:t>Key concepts:</w:t>
+        <w:t>1.5 Main outputs</w:t>
       </w:r>
     </w:p>
     <w:p>
@@ -113,7 +322,7 @@
         <w:pStyle w:val="ListBullet"/>
       </w:pPr>
       <w:r>
-        <w:t>Gene expression: how much each gene is transcribed into mRNA in a cell.</w:t>
+        <w:t>UMAP figures — visual map of all cells</w:t>
       </w:r>
     </w:p>
     <w:p>
@@ -121,7 +330,7 @@
         <w:pStyle w:val="ListBullet"/>
       </w:pPr>
       <w:r>
-        <w:t>UMI / counts matrix: table of genes (rows) × cells (columns) with read counts.</w:t>
+        <w:t>Composition barplot — who is more/less abundant per treatment</w:t>
       </w:r>
     </w:p>
     <w:p>
@@ -129,7 +338,7 @@
         <w:pStyle w:val="ListBullet"/>
       </w:pPr>
       <w:r>
-        <w:t>Cell barcode: unique ID for each captured cell (e.g. AAACCCAAGACGCATG-1).</w:t>
+        <w:t>differential_expression_all.csv — gene-level statistics</w:t>
       </w:r>
     </w:p>
     <w:p>
@@ -137,7 +346,31 @@
         <w:pStyle w:val="ListBullet"/>
       </w:pPr>
       <w:r>
-        <w:t>Feature: usually a gene; sometimes other features in the assay.</w:t>
+        <w:t>pathway_enrichment_all.csv — biological pathways</w:t>
+      </w:r>
+    </w:p>
+    <w:p>
+      <w:pPr>
+        <w:pStyle w:val="ListBullet"/>
+      </w:pPr>
+      <w:r>
+        <w:t>size_specific_effects_summary.csv — size-dependent gene sets</w:t>
+      </w:r>
+    </w:p>
+    <w:p>
+      <w:pPr>
+        <w:pStyle w:val="ListBullet"/>
+      </w:pPr>
+      <w:r>
+        <w:t>integrated_annotated.h5ad — full processed dataset for reuse</w:t>
+      </w:r>
+    </w:p>
+    <w:p>
+      <w:pPr>
+        <w:pStyle w:val="Heading1"/>
+      </w:pPr>
+      <w:r>
+        <w:t>Part 2: Genes, Cells, and Their Relationship</w:t>
       </w:r>
     </w:p>
     <w:p>
@@ -145,7 +378,746 @@
         <w:pStyle w:val="Heading2"/>
       </w:pPr>
       <w:r>
-        <w:t>1.3 PBMC and immune cell types</w:t>
+        <w:t>2.1 The count matrix (core data structure)</w:t>
+      </w:r>
+    </w:p>
+    <w:p>
+      <w:r>
+        <w:t>scRNA-seq data is stored as a count matrix — a large table of numbers:</w:t>
+      </w:r>
+    </w:p>
+    <w:p>
+      <w:r>
+        <w:t>In AnnData / Scanpy (used in this project), each ROW is one cell and each COLUMN is one gene. The value at (cell i, gene j) is how many UMIs (deduplicated reads) were detected for that gene in that cell.</w:t>
+      </w:r>
+    </w:p>
+    <w:p>
+      <w:pPr>
+        <w:pStyle w:val="ListBullet"/>
+      </w:pPr>
+      <w:r>
+        <w:t>One cell → one row → thousands of expression values (one per gene)</w:t>
+      </w:r>
+    </w:p>
+    <w:p>
+      <w:pPr>
+        <w:pStyle w:val="ListBullet"/>
+      </w:pPr>
+      <w:r>
+        <w:t>One gene → one column → expression measured in every cell</w:t>
+      </w:r>
+    </w:p>
+    <w:p>
+      <w:pPr>
+        <w:pStyle w:val="ListBullet"/>
+      </w:pPr>
+      <w:r>
+        <w:t>Relationship: each cell has a full gene expression profile; each gene is profiled across all cells</w:t>
+      </w:r>
+    </w:p>
+    <w:p>
+      <w:pPr>
+        <w:pStyle w:val="Heading2"/>
+      </w:pPr>
+      <w:r>
+        <w:t>2.2 What is a cell in the data?</w:t>
+      </w:r>
+    </w:p>
+    <w:p>
+      <w:r>
+        <w:t>Each captured cell has three layers of information:</w:t>
+      </w:r>
+    </w:p>
+    <w:p>
+      <w:pPr>
+        <w:pStyle w:val="ListBullet"/>
+      </w:pPr>
+      <w:r>
+        <w:t>Barcode — unique ID (e.g. AAACCCAAGACGCATG-1), stored as adata.obs_names</w:t>
+      </w:r>
+    </w:p>
+    <w:p>
+      <w:pPr>
+        <w:pStyle w:val="ListBullet"/>
+      </w:pPr>
+      <w:r>
+        <w:t>Metadata (adata.obs) — sample_id, condition (40nm/200nm/mix/control), cell_type, cluster, QC metrics</w:t>
+      </w:r>
+    </w:p>
+    <w:p>
+      <w:pPr>
+        <w:pStyle w:val="ListBullet"/>
+      </w:pPr>
+      <w:r>
+        <w:t>Expression profile — all gene counts for that cell (one row of adata.X)</w:t>
+      </w:r>
+    </w:p>
+    <w:p>
+      <w:r>
+        <w:t>Formula: Cell = identity (barcode) + metadata (labels) + expression profile (numbers).</w:t>
+      </w:r>
+    </w:p>
+    <w:p>
+      <w:pPr>
+        <w:pStyle w:val="Heading2"/>
+      </w:pPr>
+      <w:r>
+        <w:t>2.3 What is a gene in the data?</w:t>
+      </w:r>
+    </w:p>
+    <w:p>
+      <w:r>
+        <w:t>Each gene is a column. Gene symbols (CD3D, LYZ, ISG15, …) are in adata.var_names. Optional gene metadata is in adata.var (e.g. highly_variable, mitochondrial flag).</w:t>
+      </w:r>
+    </w:p>
+    <w:p>
+      <w:r>
+        <w:t>A marker gene is highly expressed in one cell type and low elsewhere — used to assign cell types. Example: LYZ is high in monocytes and low in T cells.</w:t>
+      </w:r>
+    </w:p>
+    <w:p>
+      <w:pPr>
+        <w:pStyle w:val="Heading2"/>
+      </w:pPr>
+      <w:r>
+        <w:t>2.4 How cells and genes relate (intuition)</w:t>
+      </w:r>
+    </w:p>
+    <w:p>
+      <w:r>
+        <w:t>Similar cells have similar rows (similar patterns across genes). Marker genes are columns that are high only in certain cell types. Differential expression compares columns (genes) between two groups of rows (cells) of the same type.</w:t>
+      </w:r>
+    </w:p>
+    <w:tbl>
+      <w:tblPr>
+        <w:tblStyle w:val="TableGrid"/>
+        <w:tblW w:type="auto" w:w="0"/>
+        <w:tblLook w:firstColumn="1" w:firstRow="1" w:lastColumn="0" w:lastRow="0" w:noHBand="0" w:noVBand="1" w:val="04A0"/>
+      </w:tblPr>
+      <w:tblGrid>
+        <w:gridCol w:w="4320"/>
+        <w:gridCol w:w="4320"/>
+      </w:tblGrid>
+      <w:tr>
+        <w:tc>
+          <w:tcPr>
+            <w:tcW w:type="dxa" w:w="4320"/>
+          </w:tcPr>
+          <w:p>
+            <w:r>
+              <w:t>Analysis level</w:t>
+            </w:r>
+          </w:p>
+        </w:tc>
+        <w:tc>
+          <w:tcPr>
+            <w:tcW w:type="dxa" w:w="4320"/>
+          </w:tcPr>
+          <w:p>
+            <w:r>
+              <w:t>Question</w:t>
+            </w:r>
+          </w:p>
+        </w:tc>
+      </w:tr>
+      <w:tr>
+        <w:tc>
+          <w:tcPr>
+            <w:tcW w:type="dxa" w:w="4320"/>
+          </w:tcPr>
+          <w:p>
+            <w:r>
+              <w:t>Cells</w:t>
+            </w:r>
+          </w:p>
+        </w:tc>
+        <w:tc>
+          <w:tcPr>
+            <w:tcW w:type="dxa" w:w="4320"/>
+          </w:tcPr>
+          <w:p>
+            <w:r>
+              <w:t>Who is there? How do cells group? (UMAP, clusters, composition)</w:t>
+            </w:r>
+          </w:p>
+        </w:tc>
+      </w:tr>
+      <w:tr>
+        <w:tc>
+          <w:tcPr>
+            <w:tcW w:type="dxa" w:w="4320"/>
+          </w:tcPr>
+          <w:p>
+            <w:r>
+              <w:t>Genes</w:t>
+            </w:r>
+          </w:p>
+        </w:tc>
+        <w:tc>
+          <w:tcPr>
+            <w:tcW w:type="dxa" w:w="4320"/>
+          </w:tcPr>
+          <w:p>
+            <w:r>
+              <w:t>What is each cell doing? What changes with treatment? (DE, pathways)</w:t>
+            </w:r>
+          </w:p>
+        </w:tc>
+      </w:tr>
+      <w:tr>
+        <w:tc>
+          <w:tcPr>
+            <w:tcW w:type="dxa" w:w="4320"/>
+          </w:tcPr>
+          <w:p>
+            <w:r>
+              <w:t>Both together</w:t>
+            </w:r>
+          </w:p>
+        </w:tc>
+        <w:tc>
+          <w:tcPr>
+            <w:tcW w:type="dxa" w:w="4320"/>
+          </w:tcPr>
+          <w:p>
+            <w:r>
+              <w:t>In monocytes under 40 nm, is gene X higher than in control monocytes?</w:t>
+            </w:r>
+          </w:p>
+        </w:tc>
+      </w:tr>
+    </w:tbl>
+    <w:p>
+      <w:pPr>
+        <w:pStyle w:val="Heading2"/>
+      </w:pPr>
+      <w:r>
+        <w:t>2.5 AnnData structure (Python object)</w:t>
+      </w:r>
+    </w:p>
+    <w:p>
+      <w:r>
+        <w:rPr>
+          <w:b/>
+        </w:rPr>
+        <w:t xml:space="preserve">adata.X — </w:t>
+      </w:r>
+      <w:r>
+        <w:t>Main expression matrix (cells × genes), often normalized/log-transformed</w:t>
+      </w:r>
+    </w:p>
+    <w:p>
+      <w:r>
+        <w:rPr>
+          <w:b/>
+        </w:rPr>
+        <w:t xml:space="preserve">adata.layers["counts"] — </w:t>
+      </w:r>
+      <w:r>
+        <w:t>Raw counts before normalization — kept for DE and pseudobulk</w:t>
+      </w:r>
+    </w:p>
+    <w:p>
+      <w:r>
+        <w:rPr>
+          <w:b/>
+        </w:rPr>
+        <w:t xml:space="preserve">adata.obs — </w:t>
+      </w:r>
+      <w:r>
+        <w:t>One row per cell: condition, cell_type_marker, cluster, QC metrics</w:t>
+      </w:r>
+    </w:p>
+    <w:p>
+      <w:r>
+        <w:rPr>
+          <w:b/>
+        </w:rPr>
+        <w:t xml:space="preserve">adata.var — </w:t>
+      </w:r>
+      <w:r>
+        <w:t>One row per gene: e.g. highly_variable, mt</w:t>
+      </w:r>
+    </w:p>
+    <w:p>
+      <w:r>
+        <w:rPr>
+          <w:b/>
+        </w:rPr>
+        <w:t xml:space="preserve">adata.obsm["X_umap"] — </w:t>
+      </w:r>
+      <w:r>
+        <w:t>2D coordinates per cell for plotting</w:t>
+      </w:r>
+    </w:p>
+    <w:p>
+      <w:r>
+        <w:t>Rule: adata.obs has the same number of rows as adata.X. adata.var has the same number of rows as adata.X has columns. Row i of X is the expression of all genes in cell i.</w:t>
+      </w:r>
+    </w:p>
+    <w:p>
+      <w:pPr>
+        <w:pStyle w:val="Heading2"/>
+      </w:pPr>
+      <w:r>
+        <w:t>2.6 From raw counts to analysis</w:t>
+      </w:r>
+    </w:p>
+    <w:p>
+      <w:r>
+        <w:rPr>
+          <w:b/>
+        </w:rPr>
+        <w:t xml:space="preserve">Raw counts (layers['counts']): </w:t>
+      </w:r>
+      <w:r>
+        <w:t>Integers from sequencing — original measurements.</w:t>
+      </w:r>
+    </w:p>
+    <w:p>
+      <w:r>
+        <w:rPr>
+          <w:b/>
+        </w:rPr>
+        <w:t xml:space="preserve">Normalization (normalize_total + log1p): </w:t>
+      </w:r>
+      <w:r>
+        <w:t>Fair comparison between cells with different sequencing depth.</w:t>
+      </w:r>
+    </w:p>
+    <w:p>
+      <w:r>
+        <w:rPr>
+          <w:b/>
+        </w:rPr>
+        <w:t xml:space="preserve">HVG selection (~3000 genes): </w:t>
+      </w:r>
+      <w:r>
+        <w:t>Keep genes that vary most; reduce noise for PCA/clustering.</w:t>
+      </w:r>
+    </w:p>
+    <w:p>
+      <w:r>
+        <w:rPr>
+          <w:b/>
+        </w:rPr>
+        <w:t xml:space="preserve">PCA + Combat + UMAP: </w:t>
+      </w:r>
+      <w:r>
+        <w:t>Compress and correct cells using gene patterns; visualize in 2D.</w:t>
+      </w:r>
+    </w:p>
+    <w:p>
+      <w:r>
+        <w:rPr>
+          <w:b/>
+        </w:rPr>
+        <w:t xml:space="preserve">Annotation: </w:t>
+      </w:r>
+      <w:r>
+        <w:t>Assign cell type labels using marker gene scores.</w:t>
+      </w:r>
+    </w:p>
+    <w:p>
+      <w:r>
+        <w:rPr>
+          <w:b/>
+        </w:rPr>
+        <w:t xml:space="preserve">Differential expression: </w:t>
+      </w:r>
+      <w:r>
+        <w:t>Within one cell type, compare each gene between exposure and control.</w:t>
+      </w:r>
+    </w:p>
+    <w:p>
+      <w:pPr>
+        <w:pStyle w:val="Heading2"/>
+      </w:pPr>
+      <w:r>
+        <w:t>2.7 Four conditions in the same matrix</w:t>
+      </w:r>
+    </w:p>
+    <w:p>
+      <w:r>
+        <w:t>All cells share the same genes (columns). They differ by metadata in adata.obs['condition']:</w:t>
+      </w:r>
+    </w:p>
+    <w:p>
+      <w:pPr>
+        <w:pStyle w:val="ListBullet"/>
+      </w:pPr>
+      <w:r>
+        <w:t>control — unexposed cells</w:t>
+      </w:r>
+    </w:p>
+    <w:p>
+      <w:pPr>
+        <w:pStyle w:val="ListBullet"/>
+      </w:pPr>
+      <w:r>
+        <w:t>PSNP_40nm — 40 nm exposure</w:t>
+      </w:r>
+    </w:p>
+    <w:p>
+      <w:pPr>
+        <w:pStyle w:val="ListBullet"/>
+      </w:pPr>
+      <w:r>
+        <w:t>PSNP_200nm — 200 nm exposure</w:t>
+      </w:r>
+    </w:p>
+    <w:p>
+      <w:pPr>
+        <w:pStyle w:val="ListBullet"/>
+      </w:pPr>
+      <w:r>
+        <w:t>PSNP_mix_40_200 — mixture exposure</w:t>
+      </w:r>
+    </w:p>
+    <w:p>
+      <w:r>
+        <w:t>Composition analysis counts rows (cells) per type per condition. DE compares gene columns between subsets of rows with the same cell type. Size-specific analysis compares sets of genes that changed under each exposure.</w:t>
+      </w:r>
+    </w:p>
+    <w:p>
+      <w:pPr>
+        <w:pStyle w:val="Heading2"/>
+      </w:pPr>
+      <w:r>
+        <w:t>2.8 Three ways to label cells</w:t>
+      </w:r>
+    </w:p>
+    <w:p>
+      <w:r>
+        <w:rPr>
+          <w:b/>
+        </w:rPr>
+        <w:t xml:space="preserve">Marker-based (run_pipeline.py): </w:t>
+      </w:r>
+      <w:r>
+        <w:t>Mean expression of known marker sets; highest score wins. Stored in cell_type_marker.</w:t>
+      </w:r>
+    </w:p>
+    <w:p>
+      <w:r>
+        <w:rPr>
+          <w:b/>
+        </w:rPr>
+        <w:t xml:space="preserve">CoDi (CSV from dataset): </w:t>
+      </w:r>
+      <w:r>
+        <w:t>External model predictions; used to validate marker-based labels.</w:t>
+      </w:r>
+    </w:p>
+    <w:p>
+      <w:r>
+        <w:rPr>
+          <w:b/>
+        </w:rPr>
+        <w:t xml:space="preserve">Azimuth (optional R script): </w:t>
+      </w:r>
+      <w:r>
+        <w:t>Maps cells to PBMC reference atlas; finer labels (e.g. CD4 vs CD8 T).</w:t>
+      </w:r>
+    </w:p>
+    <w:p>
+      <w:pPr>
+        <w:pStyle w:val="Heading2"/>
+      </w:pPr>
+      <w:r>
+        <w:t>2.9 Worked example</w:t>
+      </w:r>
+    </w:p>
+    <w:p>
+      <w:r>
+        <w:t>Question: Do 40 nm particles activate monocytes?</w:t>
+      </w:r>
+    </w:p>
+    <w:p>
+      <w:pPr>
+        <w:pStyle w:val="ListBullet"/>
+      </w:pPr>
+      <w:r>
+        <w:t>Select rows where cell_type_marker == Monocyte_CD14</w:t>
+      </w:r>
+    </w:p>
+    <w:p>
+      <w:pPr>
+        <w:pStyle w:val="ListBullet"/>
+      </w:pPr>
+      <w:r>
+        <w:t>Split into control vs PSNP_40nm using condition</w:t>
+      </w:r>
+    </w:p>
+    <w:p>
+      <w:pPr>
+        <w:pStyle w:val="ListBullet"/>
+      </w:pPr>
+      <w:r>
+        <w:t>For each gene (column), run statistical test (Wilcoxon)</w:t>
+      </w:r>
+    </w:p>
+    <w:p>
+      <w:pPr>
+        <w:pStyle w:val="ListBullet"/>
+      </w:pPr>
+      <w:r>
+        <w:t>Significant genes → pathway enrichment (inflammation, interferon, etc.)</w:t>
+      </w:r>
+    </w:p>
+    <w:p>
+      <w:r>
+        <w:t>Cells define which population you compare. Genes define what changed inside that population.</w:t>
+      </w:r>
+    </w:p>
+    <w:p>
+      <w:pPr>
+        <w:pStyle w:val="Heading2"/>
+      </w:pPr>
+      <w:r>
+        <w:t>2.10 Summary table</w:t>
+      </w:r>
+    </w:p>
+    <w:tbl>
+      <w:tblPr>
+        <w:tblStyle w:val="TableGrid"/>
+        <w:tblW w:type="auto" w:w="0"/>
+        <w:tblLook w:firstColumn="1" w:firstRow="1" w:lastColumn="0" w:lastRow="0" w:noHBand="0" w:noVBand="1" w:val="04A0"/>
+      </w:tblPr>
+      <w:tblGrid>
+        <w:gridCol w:w="4320"/>
+        <w:gridCol w:w="4320"/>
+      </w:tblGrid>
+      <w:tr>
+        <w:tc>
+          <w:tcPr>
+            <w:tcW w:type="dxa" w:w="4320"/>
+          </w:tcPr>
+          <w:p>
+            <w:r>
+              <w:t>Concept</w:t>
+            </w:r>
+          </w:p>
+        </w:tc>
+        <w:tc>
+          <w:tcPr>
+            <w:tcW w:type="dxa" w:w="4320"/>
+          </w:tcPr>
+          <w:p>
+            <w:r>
+              <w:t>In this project</w:t>
+            </w:r>
+          </w:p>
+        </w:tc>
+      </w:tr>
+      <w:tr>
+        <w:tc>
+          <w:tcPr>
+            <w:tcW w:type="dxa" w:w="4320"/>
+          </w:tcPr>
+          <w:p>
+            <w:r>
+              <w:t>Cell</w:t>
+            </w:r>
+          </w:p>
+        </w:tc>
+        <w:tc>
+          <w:tcPr>
+            <w:tcW w:type="dxa" w:w="4320"/>
+          </w:tcPr>
+          <w:p>
+            <w:r>
+              <w:t>One row + barcode + metadata (condition, type, cluster)</w:t>
+            </w:r>
+          </w:p>
+        </w:tc>
+      </w:tr>
+      <w:tr>
+        <w:tc>
+          <w:tcPr>
+            <w:tcW w:type="dxa" w:w="4320"/>
+          </w:tcPr>
+          <w:p>
+            <w:r>
+              <w:t>Gene</w:t>
+            </w:r>
+          </w:p>
+        </w:tc>
+        <w:tc>
+          <w:tcPr>
+            <w:tcW w:type="dxa" w:w="4320"/>
+          </w:tcPr>
+          <w:p>
+            <w:r>
+              <w:t>One column + symbol; values = expression per cell</w:t>
+            </w:r>
+          </w:p>
+        </w:tc>
+      </w:tr>
+      <w:tr>
+        <w:tc>
+          <w:tcPr>
+            <w:tcW w:type="dxa" w:w="4320"/>
+          </w:tcPr>
+          <w:p>
+            <w:r>
+              <w:t>Relationship</w:t>
+            </w:r>
+          </w:p>
+        </w:tc>
+        <w:tc>
+          <w:tcPr>
+            <w:tcW w:type="dxa" w:w="4320"/>
+          </w:tcPr>
+          <w:p>
+            <w:r>
+              <w:t>Matrix links them: types = row patterns; DE = column comparison within rows</w:t>
+            </w:r>
+          </w:p>
+        </w:tc>
+      </w:tr>
+      <w:tr>
+        <w:tc>
+          <w:tcPr>
+            <w:tcW w:type="dxa" w:w="4320"/>
+          </w:tcPr>
+          <w:p>
+            <w:r>
+              <w:t>File format</w:t>
+            </w:r>
+          </w:p>
+        </w:tc>
+        <w:tc>
+          <w:tcPr>
+            <w:tcW w:type="dxa" w:w="4320"/>
+          </w:tcPr>
+          <w:p>
+            <w:r>
+              <w:t>.h5ad (AnnData) stores matrix + all labels together</w:t>
+            </w:r>
+          </w:p>
+        </w:tc>
+      </w:tr>
+    </w:tbl>
+    <w:p>
+      <w:r>
+        <w:br w:type="page"/>
+      </w:r>
+    </w:p>
+    <w:p>
+      <w:pPr>
+        <w:pStyle w:val="Heading1"/>
+      </w:pPr>
+      <w:r>
+        <w:t>Part 3: Biological and Genomic Background</w:t>
+      </w:r>
+    </w:p>
+    <w:p>
+      <w:pPr>
+        <w:pStyle w:val="Heading2"/>
+      </w:pPr>
+      <w:r>
+        <w:t>3.1 What is the biological question?</w:t>
+      </w:r>
+    </w:p>
+    <w:p>
+      <w:r>
+        <w:t>Nanoplastics (tiny plastic particles, often &lt; 1 µm) can enter the bloodstream and interact directly with immune cells. Particle size (e.g. 40 nm vs 200 nm) may change how strongly and in which cell types the immune system responds.</w:t>
+      </w:r>
+    </w:p>
+    <w:p>
+      <w:r>
+        <w:t>This project uses single-cell RNA sequencing (scRNA-seq) on human peripheral blood immune cells (PBMC) from one donor exposed to:</w:t>
+      </w:r>
+    </w:p>
+    <w:p>
+      <w:pPr>
+        <w:pStyle w:val="ListBullet"/>
+      </w:pPr>
+      <w:r>
+        <w:t>Sample 1: 40 nm carboxylated polystyrene nanoparticles (PSNPs)</w:t>
+      </w:r>
+    </w:p>
+    <w:p>
+      <w:pPr>
+        <w:pStyle w:val="ListBullet"/>
+      </w:pPr>
+      <w:r>
+        <w:t>Sample 2: 200 nm PSNPs</w:t>
+      </w:r>
+    </w:p>
+    <w:p>
+      <w:pPr>
+        <w:pStyle w:val="ListBullet"/>
+      </w:pPr>
+      <w:r>
+        <w:t>Sample 3: mixture of 40 nm + 200 nm</w:t>
+      </w:r>
+    </w:p>
+    <w:p>
+      <w:pPr>
+        <w:pStyle w:val="ListBullet"/>
+      </w:pPr>
+      <w:r>
+        <w:t>Sample 4: control (no exposure)</w:t>
+      </w:r>
+    </w:p>
+    <w:p>
+      <w:pPr>
+        <w:pStyle w:val="Heading2"/>
+      </w:pPr>
+      <w:r>
+        <w:t>3.2 What is scRNA-seq?</w:t>
+      </w:r>
+    </w:p>
+    <w:p>
+      <w:r>
+        <w:t>Bulk RNA-seq measures average gene expression across millions of cells mixed together. scRNA-seq captures RNA from thousands of individual cells separately.</w:t>
+      </w:r>
+    </w:p>
+    <w:p>
+      <w:r>
+        <w:t>Key concepts:</w:t>
+      </w:r>
+    </w:p>
+    <w:p>
+      <w:pPr>
+        <w:pStyle w:val="ListBullet"/>
+      </w:pPr>
+      <w:r>
+        <w:t>Gene expression: how much each gene is transcribed into mRNA in a cell.</w:t>
+      </w:r>
+    </w:p>
+    <w:p>
+      <w:pPr>
+        <w:pStyle w:val="ListBullet"/>
+      </w:pPr>
+      <w:r>
+        <w:t>UMI / counts matrix: table of cells (rows) × genes (columns) with read counts (AnnData convention).</w:t>
+      </w:r>
+    </w:p>
+    <w:p>
+      <w:pPr>
+        <w:pStyle w:val="ListBullet"/>
+      </w:pPr>
+      <w:r>
+        <w:t>Cell barcode: unique ID for each captured cell (e.g. AAACCCAAGACGCATG-1).</w:t>
+      </w:r>
+    </w:p>
+    <w:p>
+      <w:pPr>
+        <w:pStyle w:val="ListBullet"/>
+      </w:pPr>
+      <w:r>
+        <w:t>Feature: usually a gene; sometimes other features in the assay.</w:t>
+      </w:r>
+    </w:p>
+    <w:p>
+      <w:pPr>
+        <w:pStyle w:val="Heading2"/>
+      </w:pPr>
+      <w:r>
+        <w:t>3.3 PBMC and immune cell types</w:t>
       </w:r>
     </w:p>
     <w:p>
@@ -394,7 +1366,7 @@
         <w:pStyle w:val="Heading2"/>
       </w:pPr>
       <w:r>
-        <w:t>1.4 Core bioinformatics concepts used in this pipeline</w:t>
+        <w:t>3.4 Core bioinformatics concepts used in this pipeline</w:t>
       </w:r>
     </w:p>
     <w:p>
@@ -528,7 +1500,7 @@
         <w:pStyle w:val="Heading1"/>
       </w:pPr>
       <w:r>
-        <w:t>Part 2: Project Structure and Workflow</w:t>
+        <w:t>Part 4: Project Structure and Workflow</w:t>
       </w:r>
     </w:p>
     <w:p>
@@ -536,7 +1508,7 @@
         <w:pStyle w:val="Heading2"/>
       </w:pPr>
       <w:r>
-        <w:t>2.1 Folder layout</w:t>
+        <w:t>4.1 Folder layout</w:t>
       </w:r>
     </w:p>
     <w:p>
@@ -600,7 +1572,7 @@
         <w:pStyle w:val="Heading2"/>
       </w:pPr>
       <w:r>
-        <w:t>2.2 How to run (reproducibility)</w:t>
+        <w:t>4.2 How to run (reproducibility)</w:t>
       </w:r>
     </w:p>
     <w:p>
@@ -648,7 +1620,7 @@
         <w:pStyle w:val="Heading2"/>
       </w:pPr>
       <w:r>
-        <w:t>2.3 Data format: AnnData (.h5ad)</w:t>
+        <w:t>4.3 Data format: AnnData (.h5ad)</w:t>
       </w:r>
     </w:p>
     <w:p>
@@ -706,7 +1678,7 @@
         <w:pStyle w:val="Heading1"/>
       </w:pPr>
       <w:r>
-        <w:t>Part 3: Code Explanation (function by function)</w:t>
+        <w:t>Part 5: Code Explanation (function by function)</w:t>
       </w:r>
     </w:p>
     <w:p>
@@ -949,7 +1921,7 @@
         <w:pStyle w:val="Heading1"/>
       </w:pPr>
       <w:r>
-        <w:t>Part 4: Configuration (config/config.yaml)</w:t>
+        <w:t>Part 6: Configuration (config/config.yaml)</w:t>
       </w:r>
     </w:p>
     <w:p>
@@ -1079,7 +2051,7 @@
         <w:pStyle w:val="Heading1"/>
       </w:pPr>
       <w:r>
-        <w:t>Part 5: Output Files and How to Interpret Them</w:t>
+        <w:t>Part 7: Output Files and How to Interpret Them</w:t>
       </w:r>
     </w:p>
     <w:p>
@@ -1169,7 +2141,7 @@
         <w:pStyle w:val="Heading1"/>
       </w:pPr>
       <w:r>
-        <w:t>Part 6: How to Explain Results (for defense / report)</w:t>
+        <w:t>Part 8: How to Explain Results (for defense / report)</w:t>
       </w:r>
     </w:p>
     <w:p>
@@ -1177,7 +2149,7 @@
         <w:pStyle w:val="Heading2"/>
       </w:pPr>
       <w:r>
-        <w:t>6.1 Suggested narrative</w:t>
+        <w:t>8.1 Suggested narrative</w:t>
       </w:r>
     </w:p>
     <w:p>
@@ -1249,7 +2221,7 @@
         <w:pStyle w:val="Heading2"/>
       </w:pPr>
       <w:r>
-        <w:t>6.2 Glossary (quick reference)</w:t>
+        <w:t>8.2 Glossary (quick reference)</w:t>
       </w:r>
     </w:p>
     <w:p>

</xml_diff>